<commit_message>
Add deployment URL to report materials
</commit_message>
<xml_diff>
--- a/docs/Practice_Report_Flask_Microblog.docx
+++ b/docs/Practice_Report_Flask_Microblog.docx
@@ -202,9 +202,6 @@
           </w:tcPr>
           <w:p>
             <w:r>
-              <w:rPr>
-                <w:sz w:val="20"/>
-              </w:rPr>
               <w:t>????????</w:t>
             </w:r>
           </w:p>
@@ -215,9 +212,6 @@
           </w:tcPr>
           <w:p>
             <w:r>
-              <w:rPr>
-                <w:sz w:val="20"/>
-              </w:rPr>
               <w:t>????????</w:t>
             </w:r>
           </w:p>
@@ -230,9 +224,6 @@
           </w:tcPr>
           <w:p>
             <w:r>
-              <w:rPr>
-                <w:sz w:val="20"/>
-              </w:rPr>
               <w:t>???????? ???????</w:t>
             </w:r>
           </w:p>
@@ -243,9 +234,6 @@
           </w:tcPr>
           <w:p>
             <w:r>
-              <w:rPr>
-                <w:sz w:val="20"/>
-              </w:rPr>
               <w:t>Flask Microblog</w:t>
             </w:r>
           </w:p>
@@ -258,9 +246,6 @@
           </w:tcPr>
           <w:p>
             <w:r>
-              <w:rPr>
-                <w:sz w:val="20"/>
-              </w:rPr>
               <w:t>?????? ?? ????????? ??????</w:t>
             </w:r>
           </w:p>
@@ -271,9 +256,6 @@
           </w:tcPr>
           <w:p>
             <w:r>
-              <w:rPr>
-                <w:sz w:val="20"/>
-              </w:rPr>
               <w:t>https://github.com/practical-tutorials/project-based-learning</w:t>
             </w:r>
           </w:p>
@@ -286,9 +268,6 @@
           </w:tcPr>
           <w:p>
             <w:r>
-              <w:rPr>
-                <w:sz w:val="20"/>
-              </w:rPr>
               <w:t>GitHub-???????????</w:t>
             </w:r>
           </w:p>
@@ -299,9 +278,6 @@
           </w:tcPr>
           <w:p>
             <w:r>
-              <w:rPr>
-                <w:sz w:val="20"/>
-              </w:rPr>
               <w:t>https://github.com/Popohka05/Flask-Microblog</w:t>
             </w:r>
           </w:p>
@@ -314,9 +290,6 @@
           </w:tcPr>
           <w:p>
             <w:r>
-              <w:rPr>
-                <w:sz w:val="20"/>
-              </w:rPr>
               <w:t>?????? ?? ??????</w:t>
             </w:r>
           </w:p>
@@ -327,10 +300,7 @@
           </w:tcPr>
           <w:p>
             <w:r>
-              <w:rPr>
-                <w:sz w:val="20"/>
-              </w:rPr>
-              <w:t>[???????? ????? ?????????? ? Render]</w:t>
+              <w:t>https://flask-microblog-l749.onrender.com</w:t>
             </w:r>
           </w:p>
         </w:tc>
@@ -342,9 +312,6 @@
           </w:tcPr>
           <w:p>
             <w:r>
-              <w:rPr>
-                <w:sz w:val="20"/>
-              </w:rPr>
               <w:t>Frontend</w:t>
             </w:r>
           </w:p>
@@ -355,9 +322,6 @@
           </w:tcPr>
           <w:p>
             <w:r>
-              <w:rPr>
-                <w:sz w:val="20"/>
-              </w:rPr>
               <w:t>HTML, CSS, Jinja2 Templates</w:t>
             </w:r>
           </w:p>
@@ -370,9 +334,6 @@
           </w:tcPr>
           <w:p>
             <w:r>
-              <w:rPr>
-                <w:sz w:val="20"/>
-              </w:rPr>
               <w:t>Backend</w:t>
             </w:r>
           </w:p>
@@ -383,9 +344,6 @@
           </w:tcPr>
           <w:p>
             <w:r>
-              <w:rPr>
-                <w:sz w:val="20"/>
-              </w:rPr>
               <w:t>Python 3, Flask</w:t>
             </w:r>
           </w:p>
@@ -398,9 +356,6 @@
           </w:tcPr>
           <w:p>
             <w:r>
-              <w:rPr>
-                <w:sz w:val="20"/>
-              </w:rPr>
               <w:t>???? ??????</w:t>
             </w:r>
           </w:p>
@@ -411,9 +366,6 @@
           </w:tcPr>
           <w:p>
             <w:r>
-              <w:rPr>
-                <w:sz w:val="20"/>
-              </w:rPr>
               <w:t>SQLite</w:t>
             </w:r>
           </w:p>
@@ -426,9 +378,6 @@
           </w:tcPr>
           <w:p>
             <w:r>
-              <w:rPr>
-                <w:sz w:val="20"/>
-              </w:rPr>
               <w:t>???????????</w:t>
             </w:r>
           </w:p>
@@ -439,9 +388,6 @@
           </w:tcPr>
           <w:p>
             <w:r>
-              <w:rPr>
-                <w:sz w:val="20"/>
-              </w:rPr>
               <w:t>????</w:t>
             </w:r>
           </w:p>
@@ -454,9 +400,6 @@
           </w:tcPr>
           <w:p>
             <w:r>
-              <w:rPr>
-                <w:sz w:val="20"/>
-              </w:rPr>
               <w:t>???????? ?????</w:t>
             </w:r>
           </w:p>
@@ -467,9 +410,6 @@
           </w:tcPr>
           <w:p>
             <w:r>
-              <w:rPr>
-                <w:sz w:val="20"/>
-              </w:rPr>
               <w:t>demo_alice</w:t>
             </w:r>
           </w:p>
@@ -482,9 +422,6 @@
           </w:tcPr>
           <w:p>
             <w:r>
-              <w:rPr>
-                <w:sz w:val="20"/>
-              </w:rPr>
               <w:t>???????? ??????</w:t>
             </w:r>
           </w:p>
@@ -495,9 +432,6 @@
           </w:tcPr>
           <w:p>
             <w:r>
-              <w:rPr>
-                <w:sz w:val="20"/>
-              </w:rPr>
               <w:t>demo123</w:t>
             </w:r>
           </w:p>
@@ -510,9 +444,6 @@
           </w:tcPr>
           <w:p>
             <w:r>
-              <w:rPr>
-                <w:sz w:val="20"/>
-              </w:rPr>
               <w:t>???????? ????????</w:t>
             </w:r>
           </w:p>
@@ -523,9 +454,6 @@
           </w:tcPr>
           <w:p>
             <w:r>
-              <w:rPr>
-                <w:sz w:val="20"/>
-              </w:rPr>
               <w:t>User, Post, followers</w:t>
             </w:r>
           </w:p>
@@ -538,9 +466,6 @@
           </w:tcPr>
           <w:p>
             <w:r>
-              <w:rPr>
-                <w:sz w:val="20"/>
-              </w:rPr>
               <w:t>????????? ??????</w:t>
             </w:r>
           </w:p>
@@ -551,9 +476,6 @@
           </w:tcPr>
           <w:p>
             <w:r>
-              <w:rPr>
-                <w:sz w:val="20"/>
-              </w:rPr>
               <w:t>flask --app run init-db; flask --app run run</w:t>
             </w:r>
           </w:p>
@@ -825,9 +747,6 @@
           </w:tcPr>
           <w:p>
             <w:r>
-              <w:rPr>
-                <w:sz w:val="20"/>
-              </w:rPr>
               <w:t>??????? ???????</w:t>
             </w:r>
           </w:p>
@@ -838,9 +757,6 @@
           </w:tcPr>
           <w:p>
             <w:r>
-              <w:rPr>
-                <w:sz w:val="20"/>
-              </w:rPr>
               <w:t>?????? ?? ????/????? ? GitHub</w:t>
             </w:r>
           </w:p>
@@ -851,9 +767,6 @@
           </w:tcPr>
           <w:p>
             <w:r>
-              <w:rPr>
-                <w:sz w:val="20"/>
-              </w:rPr>
               <w:t>?????? ?? ?????/????????</w:t>
             </w:r>
           </w:p>
@@ -866,9 +779,6 @@
           </w:tcPr>
           <w:p>
             <w:r>
-              <w:rPr>
-                <w:sz w:val="20"/>
-              </w:rPr>
               <w:t>??????????? ????????????</w:t>
             </w:r>
           </w:p>
@@ -879,9 +789,6 @@
           </w:tcPr>
           <w:p>
             <w:r>
-              <w:rPr>
-                <w:sz w:val="20"/>
-              </w:rPr>
               <w:t>https://github.com/Popohka05/Flask-Microblog/blob/main/app/routes.py</w:t>
             </w:r>
           </w:p>
@@ -892,9 +799,6 @@
           </w:tcPr>
           <w:p>
             <w:r>
-              <w:rPr>
-                <w:sz w:val="20"/>
-              </w:rPr>
               <w:t>/register</w:t>
             </w:r>
           </w:p>
@@ -907,9 +811,6 @@
           </w:tcPr>
           <w:p>
             <w:r>
-              <w:rPr>
-                <w:sz w:val="20"/>
-              </w:rPr>
               <w:t>??????????? ????????????</w:t>
             </w:r>
           </w:p>
@@ -920,9 +821,6 @@
           </w:tcPr>
           <w:p>
             <w:r>
-              <w:rPr>
-                <w:sz w:val="20"/>
-              </w:rPr>
               <w:t>https://github.com/Popohka05/Flask-Microblog/blob/main/app/routes.py</w:t>
             </w:r>
           </w:p>
@@ -933,9 +831,6 @@
           </w:tcPr>
           <w:p>
             <w:r>
-              <w:rPr>
-                <w:sz w:val="20"/>
-              </w:rPr>
               <w:t>/login</w:t>
             </w:r>
           </w:p>
@@ -948,9 +843,6 @@
           </w:tcPr>
           <w:p>
             <w:r>
-              <w:rPr>
-                <w:sz w:val="20"/>
-              </w:rPr>
               <w:t>???????? ????? ? ???????????? ?????</w:t>
             </w:r>
           </w:p>
@@ -961,9 +853,6 @@
           </w:tcPr>
           <w:p>
             <w:r>
-              <w:rPr>
-                <w:sz w:val="20"/>
-              </w:rPr>
               <w:t>https://github.com/Popohka05/Flask-Microblog/blob/main/app/routes.py</w:t>
             </w:r>
           </w:p>
@@ -974,9 +863,6 @@
           </w:tcPr>
           <w:p>
             <w:r>
-              <w:rPr>
-                <w:sz w:val="20"/>
-              </w:rPr>
               <w:t>/</w:t>
             </w:r>
           </w:p>
@@ -989,9 +875,6 @@
           </w:tcPr>
           <w:p>
             <w:r>
-              <w:rPr>
-                <w:sz w:val="20"/>
-              </w:rPr>
               <w:t>???????? ??????? ????????????</w:t>
             </w:r>
           </w:p>
@@ -1002,9 +885,6 @@
           </w:tcPr>
           <w:p>
             <w:r>
-              <w:rPr>
-                <w:sz w:val="20"/>
-              </w:rPr>
               <w:t>https://github.com/Popohka05/Flask-Microblog/blob/main/app/templates/profile.html</w:t>
             </w:r>
           </w:p>
@@ -1015,9 +895,6 @@
           </w:tcPr>
           <w:p>
             <w:r>
-              <w:rPr>
-                <w:sz w:val="20"/>
-              </w:rPr>
               <w:t>/user/&lt;username&gt;</w:t>
             </w:r>
           </w:p>
@@ -1030,9 +907,6 @@
           </w:tcPr>
           <w:p>
             <w:r>
-              <w:rPr>
-                <w:sz w:val="20"/>
-              </w:rPr>
               <w:t>?????????????? ???????</w:t>
             </w:r>
           </w:p>
@@ -1043,9 +917,6 @@
           </w:tcPr>
           <w:p>
             <w:r>
-              <w:rPr>
-                <w:sz w:val="20"/>
-              </w:rPr>
               <w:t>https://github.com/Popohka05/Flask-Microblog/blob/main/app/routes.py</w:t>
             </w:r>
           </w:p>
@@ -1056,9 +927,6 @@
           </w:tcPr>
           <w:p>
             <w:r>
-              <w:rPr>
-                <w:sz w:val="20"/>
-              </w:rPr>
               <w:t>/profile/edit</w:t>
             </w:r>
           </w:p>
@@ -1071,9 +939,6 @@
           </w:tcPr>
           <w:p>
             <w:r>
-              <w:rPr>
-                <w:sz w:val="20"/>
-              </w:rPr>
               <w:t>???????? ??????????</w:t>
             </w:r>
           </w:p>
@@ -1084,9 +949,6 @@
           </w:tcPr>
           <w:p>
             <w:r>
-              <w:rPr>
-                <w:sz w:val="20"/>
-              </w:rPr>
               <w:t>https://github.com/Popohka05/Flask-Microblog/blob/main/app/routes.py</w:t>
             </w:r>
           </w:p>
@@ -1097,9 +959,6 @@
           </w:tcPr>
           <w:p>
             <w:r>
-              <w:rPr>
-                <w:sz w:val="20"/>
-              </w:rPr>
               <w:t>/posts/create</w:t>
             </w:r>
           </w:p>
@@ -1112,9 +971,6 @@
           </w:tcPr>
           <w:p>
             <w:r>
-              <w:rPr>
-                <w:sz w:val="20"/>
-              </w:rPr>
               <w:t>?????????????? ??????????</w:t>
             </w:r>
           </w:p>
@@ -1125,9 +981,6 @@
           </w:tcPr>
           <w:p>
             <w:r>
-              <w:rPr>
-                <w:sz w:val="20"/>
-              </w:rPr>
               <w:t>https://github.com/Popohka05/Flask-Microblog/blob/main/app/routes.py</w:t>
             </w:r>
           </w:p>
@@ -1138,9 +991,6 @@
           </w:tcPr>
           <w:p>
             <w:r>
-              <w:rPr>
-                <w:sz w:val="20"/>
-              </w:rPr>
               <w:t>/posts/&lt;id&gt;/edit</w:t>
             </w:r>
           </w:p>
@@ -1153,9 +1003,6 @@
           </w:tcPr>
           <w:p>
             <w:r>
-              <w:rPr>
-                <w:sz w:val="20"/>
-              </w:rPr>
               <w:t>???????? ??????????</w:t>
             </w:r>
           </w:p>
@@ -1166,9 +1013,6 @@
           </w:tcPr>
           <w:p>
             <w:r>
-              <w:rPr>
-                <w:sz w:val="20"/>
-              </w:rPr>
               <w:t>https://github.com/Popohka05/Flask-Microblog/blob/main/app/routes.py</w:t>
             </w:r>
           </w:p>
@@ -1179,9 +1023,6 @@
           </w:tcPr>
           <w:p>
             <w:r>
-              <w:rPr>
-                <w:sz w:val="20"/>
-              </w:rPr>
               <w:t>/posts/&lt;id&gt;/delete</w:t>
             </w:r>
           </w:p>
@@ -1194,9 +1035,6 @@
           </w:tcPr>
           <w:p>
             <w:r>
-              <w:rPr>
-                <w:sz w:val="20"/>
-              </w:rPr>
               <w:t>???????? ? ???????</w:t>
             </w:r>
           </w:p>
@@ -1207,9 +1045,6 @@
           </w:tcPr>
           <w:p>
             <w:r>
-              <w:rPr>
-                <w:sz w:val="20"/>
-              </w:rPr>
               <w:t>https://github.com/Popohka05/Flask-Microblog/blob/main/app/models.py</w:t>
             </w:r>
           </w:p>
@@ -1220,9 +1055,6 @@
           </w:tcPr>
           <w:p>
             <w:r>
-              <w:rPr>
-                <w:sz w:val="20"/>
-              </w:rPr>
               <w:t>/follow/&lt;username&gt;, /unfollow/&lt;username&gt;</w:t>
             </w:r>
           </w:p>
@@ -1235,9 +1067,6 @@
           </w:tcPr>
           <w:p>
             <w:r>
-              <w:rPr>
-                <w:sz w:val="20"/>
-              </w:rPr>
               <w:t>????? ????????????? ? ??????????</w:t>
             </w:r>
           </w:p>
@@ -1248,9 +1077,6 @@
           </w:tcPr>
           <w:p>
             <w:r>
-              <w:rPr>
-                <w:sz w:val="20"/>
-              </w:rPr>
               <w:t>https://github.com/Popohka05/Flask-Microblog/blob/main/app/routes.py</w:t>
             </w:r>
           </w:p>
@@ -1261,9 +1087,6 @@
           </w:tcPr>
           <w:p>
             <w:r>
-              <w:rPr>
-                <w:sz w:val="20"/>
-              </w:rPr>
               <w:t>/search</w:t>
             </w:r>
           </w:p>
@@ -1276,9 +1099,6 @@
           </w:tcPr>
           <w:p>
             <w:r>
-              <w:rPr>
-                <w:sz w:val="20"/>
-              </w:rPr>
               <w:t>???????? ?????? ? ??????</w:t>
             </w:r>
           </w:p>
@@ -1289,9 +1109,6 @@
           </w:tcPr>
           <w:p>
             <w:r>
-              <w:rPr>
-                <w:sz w:val="20"/>
-              </w:rPr>
               <w:t>https://github.com/Popohka05/Flask-Microblog/blob/main/app/models.py</w:t>
             </w:r>
           </w:p>
@@ -1302,9 +1119,6 @@
           </w:tcPr>
           <w:p>
             <w:r>
-              <w:rPr>
-                <w:sz w:val="20"/>
-              </w:rPr>
               <w:t>SQLite database</w:t>
             </w:r>
           </w:p>
@@ -1317,9 +1131,6 @@
           </w:tcPr>
           <w:p>
             <w:r>
-              <w:rPr>
-                <w:sz w:val="20"/>
-              </w:rPr>
               <w:t>???????? ???????? ????????? ???????</w:t>
             </w:r>
           </w:p>
@@ -1330,9 +1141,6 @@
           </w:tcPr>
           <w:p>
             <w:r>
-              <w:rPr>
-                <w:sz w:val="20"/>
-              </w:rPr>
               <w:t>https://github.com/Popohka05/Flask-Microblog/blob/main/tests/test_app.py</w:t>
             </w:r>
           </w:p>
@@ -1343,9 +1151,6 @@
           </w:tcPr>
           <w:p>
             <w:r>
-              <w:rPr>
-                <w:sz w:val="20"/>
-              </w:rPr>
               <w:t>pytest</w:t>
             </w:r>
           </w:p>
@@ -1373,7 +1178,7 @@
     </w:p>
     <w:p>
       <w:r>
-        <w:t>?????? ?? ????????????: [???????? ????? ?????? ??????].</w:t>
+        <w:t>?????? ?? ????????????: ??? ????????????? ????? ???????????? ?????? ?? ?????????????? ?????? https://flask-microblog-l749.onrender.com ? ????????? ????????? ?????? ??????.</w:t>
       </w:r>
     </w:p>
     <w:p>

</xml_diff>